<commit_message>
Update strategy manual to v2.0 with dual indicator system
- Version bumped to 2.0 | June 2026
- Signal instrument updated to DXY (primary) + USDJPY (secondary)
- XAUUSD removed from execution pairs (7 pairs now active)
- Backtest period updated to September 2023 – May 2026
- Portfolio Net R updated to +420.1R (PF 2.00) from +165.7R
- Section 8 performance table updated with v2.0 per-signal stats
- Trade type tables updated: GAP_REJ split into LONG/SHORT sub-types;
  REV updated to USDJPY indicator with impulse/dist filters and split TP;
  LON_ATTR restricted to USDJPY/NZDUSD/AUDUSD with per-pair TP mult;
  ATTR_CORE updated to USDJPY indicator with regime-split TP
- Section 13 heading updated to 7 pairs (v2.0 parameters)
- Document footer updated to June 2026

Co-Authored-By: Claude Sonnet 4.6 <noreply@anthropic.com>
</commit_message>
<xml_diff>
--- a/DXY_Pair_Strategy_Manual.docx
+++ b/DXY_Pair_Strategy_Manual.docx
@@ -70,7 +70,7 @@
           <w:i/>
           <w:color w:val="444444"/>
         </w:rPr>
-        <w:t>Version 1.0  |  May 2026</w:t>
+        <w:t>Version 2.0  |  June 2026</w:t>
       </w:r>
     </w:p>
     <w:p>
@@ -172,7 +172,7 @@
                 <w:color w:val="1A1A1A"/>
                 <w:sz w:val="19"/>
               </w:rPr>
-              <w:t>DXY (US Dollar Index) — 15-minute chart</w:t>
+              <w:t>DXY (primary: LON_ATTR + GAP_REJ_LONG)  ·  USDJPY (secondary: REV + ATTR_CORE + GAP_REJ_SHORT)</w:t>
             </w:r>
           </w:p>
         </w:tc>
@@ -215,7 +215,7 @@
                 <w:color w:val="1A1A1A"/>
                 <w:sz w:val="19"/>
               </w:rPr>
-              <w:t>EURUSD · GBPUSD · AUDUSD · NZDUSD · USDJPY · USDCAD · USDCHF · XAUUSD</w:t>
+              <w:t>EURUSD · GBPUSD · AUDUSD · NZDUSD · USDJPY · USDCAD · USDCHF</w:t>
             </w:r>
           </w:p>
         </w:tc>
@@ -258,7 +258,7 @@
                 <w:color w:val="1A1A1A"/>
                 <w:sz w:val="19"/>
               </w:rPr>
-              <w:t>August 2023 – April 2026 (32.4 months)</w:t>
+              <w:t>September 2023 – May 2026 (32.4 months)</w:t>
             </w:r>
           </w:p>
         </w:tc>
@@ -430,7 +430,7 @@
                 <w:color w:val="1A1A1A"/>
                 <w:sz w:val="19"/>
               </w:rPr>
-              <w:t>+165.7R over 32.4 months (original parameters)</w:t>
+              <w:t>+420.1R over 32.4 months (v2.0 parameters)</w:t>
             </w:r>
           </w:p>
         </w:tc>
@@ -598,8 +598,485 @@
           <w:color w:val="7A5C10"/>
           <w:sz w:val="20"/>
         </w:rPr>
-        <w:t>ℹ</w:t>
-      </w:r>
+        <w:t>ℹ  Key finding: Setting a fixed R:R target on pairs (e.g. 1:1) produces Net −15.0R over 32 months. Using DXY-exit timing produces Net +80.1R. The DXY-exit approach is non-negotiable.</w:t>
+      </w:r>
+    </w:p>
+    <w:p>
+      <w:pPr>
+        <w:pBdr>
+          <w:bottom w:val="single" w:sz="4" w:space="1" w:color="DDDDDD"/>
+        </w:pBdr>
+        <w:spacing w:before="120" w:after="120"/>
+      </w:pPr>
+    </w:p>
+    <w:p>
+      <w:pPr>
+        <w:pBdr>
+          <w:bottom w:val="single" w:sz="6" w:space="4" w:color="C9A02C"/>
+        </w:pBdr>
+        <w:spacing w:before="360" w:after="80"/>
+      </w:pPr>
+      <w:r>
+        <w:rPr>
+          <w:rFonts w:ascii="Arial" w:hAnsi="Arial"/>
+          <w:b/>
+          <w:color w:val="1A375E"/>
+          <w:sz w:val="32"/>
+        </w:rPr>
+        <w:t>SECTION 2 — HOW THE INDICATORS WORK</w:t>
+      </w:r>
+    </w:p>
+    <w:p>
+      <w:pPr>
+        <w:spacing w:before="240" w:after="60"/>
+      </w:pPr>
+      <w:r>
+        <w:rPr>
+          <w:rFonts w:ascii="Arial" w:hAnsi="Arial"/>
+          <w:b/>
+          <w:color w:val="C9A02C"/>
+          <w:sz w:val="26"/>
+        </w:rPr>
+        <w:t>2.1  DXYTradeAlert.pine — The Signal Indicator</w:t>
+      </w:r>
+    </w:p>
+    <w:p>
+      <w:pPr>
+        <w:spacing w:after="120"/>
+      </w:pPr>
+      <w:r>
+        <w:rPr>
+          <w:rFonts w:ascii="Arial" w:hAnsi="Arial"/>
+          <w:color w:val="1A1A1A"/>
+        </w:rPr>
+        <w:t>Applied to the DXY 15-minute chart on TradingView. This is the primary indicator you watch every day.</w:t>
+      </w:r>
+    </w:p>
+    <w:p>
+      <w:pPr>
+        <w:spacing w:before="160" w:after="40"/>
+      </w:pPr>
+      <w:r>
+        <w:rPr>
+          <w:rFonts w:ascii="Arial" w:hAnsi="Arial"/>
+          <w:b/>
+          <w:color w:val="1A375E"/>
+        </w:rPr>
+        <w:t>What it draws on the chart</w:t>
+      </w:r>
+    </w:p>
+    <w:p>
+      <w:pPr>
+        <w:pStyle w:val="ListBullet"/>
+        <w:spacing w:before="20" w:after="40"/>
+        <w:ind w:left="340"/>
+      </w:pPr>
+      <w:r>
+        <w:rPr>
+          <w:rFonts w:ascii="Arial" w:hAnsi="Arial"/>
+          <w:color w:val="1A1A1A"/>
+          <w:sz w:val="21"/>
+        </w:rPr>
+        <w:t>Yellow horizontal line — London session opening price (07:00 UTC each day, 06:30 UTC Monday).</w:t>
+      </w:r>
+    </w:p>
+    <w:p>
+      <w:pPr>
+        <w:pStyle w:val="ListBullet"/>
+        <w:spacing w:before="20" w:after="40"/>
+        <w:ind w:left="340"/>
+      </w:pPr>
+      <w:r>
+        <w:rPr>
+          <w:rFonts w:ascii="Arial" w:hAnsi="Arial"/>
+          <w:color w:val="1A1A1A"/>
+          <w:sz w:val="21"/>
+        </w:rPr>
+        <w:t>Dashed red line — prior calendar day high (structural SL reference for REV SHORT).</w:t>
+      </w:r>
+    </w:p>
+    <w:p>
+      <w:pPr>
+        <w:pStyle w:val="ListBullet"/>
+        <w:spacing w:before="20" w:after="40"/>
+        <w:ind w:left="340"/>
+      </w:pPr>
+      <w:r>
+        <w:rPr>
+          <w:rFonts w:ascii="Arial" w:hAnsi="Arial"/>
+          <w:color w:val="1A1A1A"/>
+          <w:sz w:val="21"/>
+        </w:rPr>
+        <w:t>Dashed green line — prior calendar day low (structural SL reference for REV LONG).</w:t>
+      </w:r>
+    </w:p>
+    <w:p>
+      <w:pPr>
+        <w:pStyle w:val="ListBullet"/>
+        <w:spacing w:before="20" w:after="40"/>
+        <w:ind w:left="340"/>
+      </w:pPr>
+      <w:r>
+        <w:rPr>
+          <w:rFonts w:ascii="Arial" w:hAnsi="Arial"/>
+          <w:color w:val="1A1A1A"/>
+          <w:sz w:val="21"/>
+        </w:rPr>
+        <w:t>Green/Red box — Tokyo gap zone (gap between 23:15 UTC reference close and 23:45 UTC open). Green = gap-down pristine. Red = gap-up pristine. Grey = gap has been touched/filled.</w:t>
+      </w:r>
+    </w:p>
+    <w:p>
+      <w:pPr>
+        <w:pStyle w:val="ListBullet"/>
+        <w:spacing w:before="20" w:after="40"/>
+        <w:ind w:left="340"/>
+      </w:pPr>
+      <w:r>
+        <w:rPr>
+          <w:rFonts w:ascii="Arial" w:hAnsi="Arial"/>
+          <w:color w:val="1A1A1A"/>
+          <w:sz w:val="21"/>
+        </w:rPr>
+        <w:lastRenderedPageBreak/>
+        <w:t>Yellow box — LON_ATTR zone (body of the London open candle). Yellow = pristine/untouched. Grey = violated.</w:t>
+      </w:r>
+    </w:p>
+    <w:p>
+      <w:pPr>
+        <w:pStyle w:val="ListBullet"/>
+        <w:spacing w:before="20" w:after="40"/>
+        <w:ind w:left="340"/>
+      </w:pPr>
+      <w:r>
+        <w:rPr>
+          <w:rFonts w:ascii="Arial" w:hAnsi="Arial"/>
+          <w:color w:val="1A1A1A"/>
+          <w:sz w:val="21"/>
+        </w:rPr>
+        <w:t>Orange background fill — active when 4H Bollinger Bands are flat (GAP_REJ/ATTR_CORE conditions allowed).</w:t>
+      </w:r>
+    </w:p>
+    <w:p>
+      <w:pPr>
+        <w:pStyle w:val="ListBullet"/>
+        <w:spacing w:before="20" w:after="40"/>
+        <w:ind w:left="340"/>
+      </w:pPr>
+      <w:r>
+        <w:rPr>
+          <w:rFonts w:ascii="Arial" w:hAnsi="Arial"/>
+          <w:color w:val="1A1A1A"/>
+          <w:sz w:val="21"/>
+        </w:rPr>
+        <w:t>Signal labels — appear above (▼ SHORT) or below (▲ LONG) the signal candle at bar close.</w:t>
+      </w:r>
+    </w:p>
+    <w:p>
+      <w:pPr>
+        <w:pStyle w:val="ListBullet"/>
+        <w:spacing w:before="20" w:after="40"/>
+        <w:ind w:left="340"/>
+      </w:pPr>
+      <w:r>
+        <w:rPr>
+          <w:rFonts w:ascii="Arial" w:hAnsi="Arial"/>
+          <w:color w:val="1A1A1A"/>
+          <w:sz w:val="21"/>
+        </w:rPr>
+        <w:t>TP and SL lines — drawn at the time of each signal, showing exact price levels.</w:t>
+      </w:r>
+    </w:p>
+    <w:p>
+      <w:pPr>
+        <w:spacing w:before="160" w:after="40"/>
+      </w:pPr>
+      <w:r>
+        <w:rPr>
+          <w:rFonts w:ascii="Arial" w:hAnsi="Arial"/>
+          <w:b/>
+          <w:color w:val="1A375E"/>
+        </w:rPr>
+        <w:t>What it calculates in the background</w:t>
+      </w:r>
+    </w:p>
+    <w:p>
+      <w:pPr>
+        <w:pStyle w:val="ListBullet"/>
+        <w:spacing w:before="20" w:after="40"/>
+        <w:ind w:left="340"/>
+      </w:pPr>
+      <w:r>
+        <w:rPr>
+          <w:rFonts w:ascii="Arial" w:hAnsi="Arial"/>
+          <w:color w:val="1A1A1A"/>
+          <w:sz w:val="21"/>
+        </w:rPr>
+        <w:t>4H and 1H Bollinger Band regime (+1 bullish expansion / −1 bearish expansion / 0 flat).</w:t>
+      </w:r>
+    </w:p>
+    <w:p>
+      <w:pPr>
+        <w:pStyle w:val="ListBullet"/>
+        <w:spacing w:before="20" w:after="40"/>
+        <w:ind w:left="340"/>
+      </w:pPr>
+      <w:r>
+        <w:rPr>
+          <w:rFonts w:ascii="Arial" w:hAnsi="Arial"/>
+          <w:color w:val="1A1A1A"/>
+          <w:sz w:val="21"/>
+        </w:rPr>
+        <w:t>Tokyo gap size in pts: (23:45 open − 23:15 close) × 10,000.</w:t>
+      </w:r>
+    </w:p>
+    <w:p>
+      <w:pPr>
+        <w:pStyle w:val="ListBullet"/>
+        <w:spacing w:before="20" w:after="40"/>
+        <w:ind w:left="340"/>
+      </w:pPr>
+      <w:r>
+        <w:rPr>
+          <w:rFonts w:ascii="Arial" w:hAnsi="Arial"/>
+          <w:color w:val="1A1A1A"/>
+          <w:sz w:val="21"/>
+        </w:rPr>
+        <w:t>Whether the gap has been touched this session (attr_gap_touched flag).</w:t>
+      </w:r>
+    </w:p>
+    <w:p>
+      <w:pPr>
+        <w:pStyle w:val="ListBullet"/>
+        <w:spacing w:before="20" w:after="40"/>
+        <w:ind w:left="340"/>
+      </w:pPr>
+      <w:r>
+        <w:rPr>
+          <w:rFonts w:ascii="Arial" w:hAnsi="Arial"/>
+          <w:color w:val="1A1A1A"/>
+          <w:sz w:val="21"/>
+        </w:rPr>
+        <w:t>Gap size at the moment London opened (CORE filter 1).</w:t>
+      </w:r>
+    </w:p>
+    <w:p>
+      <w:pPr>
+        <w:pStyle w:val="ListBullet"/>
+        <w:spacing w:before="20" w:after="40"/>
+        <w:ind w:left="340"/>
+      </w:pPr>
+      <w:r>
+        <w:rPr>
+          <w:rFonts w:ascii="Arial" w:hAnsi="Arial"/>
+          <w:color w:val="1A1A1A"/>
+          <w:sz w:val="21"/>
+        </w:rPr>
+        <w:t>Wave extension since London open (CORE filter 2).</w:t>
+      </w:r>
+    </w:p>
+    <w:p>
+      <w:pPr>
+        <w:pStyle w:val="ListBullet"/>
+        <w:spacing w:before="20" w:after="40"/>
+        <w:ind w:left="340"/>
+      </w:pPr>
+      <w:r>
+        <w:rPr>
+          <w:rFonts w:ascii="Arial" w:hAnsi="Arial"/>
+          <w:color w:val="1A1A1A"/>
+          <w:sz w:val="21"/>
+        </w:rPr>
+        <w:t>Maximum up/down move from the London open level this session (for REV detection).</w:t>
+      </w:r>
+    </w:p>
+    <w:p>
+      <w:pPr>
+        <w:spacing w:before="160" w:after="40"/>
+      </w:pPr>
+      <w:r>
+        <w:rPr>
+          <w:rFonts w:ascii="Arial" w:hAnsi="Arial"/>
+          <w:b/>
+          <w:color w:val="1A375E"/>
+        </w:rPr>
+        <w:t>When it fires an alert</w:t>
+      </w:r>
+    </w:p>
+    <w:p>
+      <w:pPr>
+        <w:spacing w:after="120"/>
+      </w:pPr>
+      <w:r>
+        <w:rPr>
+          <w:rFonts w:ascii="Arial" w:hAnsi="Arial"/>
+          <w:color w:val="1A1A1A"/>
+        </w:rPr>
+        <w:t>All signals fire only at the close of a 15-minute candle (barstate.isconfirmed). Signals never appear mid-candle and cannot "disappear" during candle formation.</w:t>
+      </w:r>
+    </w:p>
+    <w:p>
+      <w:pPr>
+        <w:spacing w:before="240" w:after="60"/>
+      </w:pPr>
+      <w:r>
+        <w:rPr>
+          <w:rFonts w:ascii="Arial" w:hAnsi="Arial"/>
+          <w:b/>
+          <w:color w:val="C9A02C"/>
+          <w:sz w:val="26"/>
+        </w:rPr>
+        <w:t>2.2  DXYPairLevels.pine — The Pair Entry/Exit Indicator</w:t>
+      </w:r>
+    </w:p>
+    <w:p>
+      <w:pPr>
+        <w:spacing w:after="120"/>
+      </w:pPr>
+      <w:r>
+        <w:rPr>
+          <w:rFonts w:ascii="Arial" w:hAnsi="Arial"/>
+          <w:color w:val="1A1A1A"/>
+        </w:rPr>
+        <w:t>Applied to any of the 8 supported pair charts (15-minute timeframe) on TradingView. It reads DXY data in the background using request.security and converts signal levels to the pair's price scale.</w:t>
+      </w:r>
+    </w:p>
+    <w:p>
+      <w:pPr>
+        <w:spacing w:before="160" w:after="40"/>
+      </w:pPr>
+      <w:r>
+        <w:rPr>
+          <w:rFonts w:ascii="Arial" w:hAnsi="Arial"/>
+          <w:b/>
+          <w:color w:val="1A375E"/>
+        </w:rPr>
+        <w:t>What it draws on the pair chart</w:t>
+      </w:r>
+    </w:p>
+    <w:p>
+      <w:pPr>
+        <w:pStyle w:val="ListBullet"/>
+        <w:spacing w:before="20" w:after="40"/>
+        <w:ind w:left="340"/>
+      </w:pPr>
+      <w:r>
+        <w:rPr>
+          <w:rFonts w:ascii="Arial" w:hAnsi="Arial"/>
+          <w:color w:val="1A1A1A"/>
+          <w:sz w:val="21"/>
+        </w:rPr>
+        <w:t>Entry label (▲ below bar for long, ▼ above bar for short) at the moment DXY fires a signal.</w:t>
+      </w:r>
+    </w:p>
+    <w:p>
+      <w:pPr>
+        <w:pStyle w:val="ListBullet"/>
+        <w:spacing w:before="20" w:after="40"/>
+        <w:ind w:left="340"/>
+      </w:pPr>
+      <w:r>
+        <w:rPr>
+          <w:rFonts w:ascii="Arial" w:hAnsi="Arial"/>
+          <w:color w:val="1A1A1A"/>
+          <w:sz w:val="21"/>
+        </w:rPr>
+        <w:t>Green dashed TP line — estimated pair TP (derived from DXY TP level via tick_factor conversion).</w:t>
+      </w:r>
+    </w:p>
+    <w:p>
+      <w:pPr>
+        <w:pStyle w:val="ListBullet"/>
+        <w:spacing w:before="20" w:after="40"/>
+        <w:ind w:left="340"/>
+      </w:pPr>
+      <w:r>
+        <w:rPr>
+          <w:rFonts w:ascii="Arial" w:hAnsi="Arial"/>
+          <w:color w:val="1A1A1A"/>
+          <w:sz w:val="21"/>
+        </w:rPr>
+        <w:t>Red dashed SL line — estimated pair SL (hard-stop placement reference).</w:t>
+      </w:r>
+    </w:p>
+    <w:p>
+      <w:pPr>
+        <w:spacing w:before="160" w:after="40"/>
+      </w:pPr>
+      <w:r>
+        <w:rPr>
+          <w:rFonts w:ascii="Arial" w:hAnsi="Arial"/>
+          <w:b/>
+          <w:color w:val="1A375E"/>
+        </w:rPr>
+        <w:t>Key behaviours</w:t>
+      </w:r>
+    </w:p>
+    <w:p>
+      <w:pPr>
+        <w:pStyle w:val="ListBullet"/>
+        <w:spacing w:before="20" w:after="40"/>
+        <w:ind w:left="340"/>
+      </w:pPr>
+      <w:r>
+        <w:rPr>
+          <w:rFonts w:ascii="Arial" w:hAnsi="Arial"/>
+          <w:color w:val="1A1A1A"/>
+          <w:sz w:val="21"/>
+        </w:rPr>
+        <w:t>Auto-detects the pair from the chart symbol — no manual configuration needed when switching pairs.</w:t>
+      </w:r>
+    </w:p>
+    <w:p>
+      <w:pPr>
+        <w:pStyle w:val="ListBullet"/>
+        <w:spacing w:before="20" w:after="40"/>
+        <w:ind w:left="340"/>
+      </w:pPr>
+      <w:r>
+        <w:rPr>
+          <w:rFonts w:ascii="Arial" w:hAnsi="Arial"/>
+          <w:color w:val="1A1A1A"/>
+          <w:sz w:val="21"/>
+        </w:rPr>
+        <w:t>Auto-determines trade direction from DXY signal direction + pair type (USD base vs USD quote).</w:t>
+      </w:r>
+    </w:p>
+    <w:p>
+      <w:pPr>
+        <w:pStyle w:val="ListBullet"/>
+        <w:spacing w:before="20" w:after="40"/>
+        <w:ind w:left="340"/>
+      </w:pPr>
+      <w:r>
+        <w:rPr>
+          <w:rFonts w:ascii="Arial" w:hAnsi="Arial"/>
+          <w:color w:val="1A1A1A"/>
+          <w:sz w:val="21"/>
+        </w:rPr>
+        <w:t>Fires webhook JSON alerts compatible with broker automation (e.g. 3Commas, Alertatron).</w:t>
+      </w:r>
+    </w:p>
+    <w:p>
+      <w:pPr>
+        <w:pStyle w:val="ListBullet"/>
+        <w:spacing w:before="20" w:after="40"/>
+        <w:ind w:left="340"/>
+      </w:pPr>
+      <w:r>
+        <w:rPr>
+          <w:rFonts w:ascii="Arial" w:hAnsi="Arial"/>
+          <w:color w:val="1A1A1A"/>
+          <w:sz w:val="21"/>
+        </w:rPr>
+        <w:t>Signals fire at bar close only (barstate.isconfirmed) — consistent with DXYTradeAlert.</w:t>
+      </w:r>
+    </w:p>
+    <w:p>
+      <w:pPr>
+        <w:shd w:val="clear" w:color="auto" w:fill="FFF8E7"/>
+        <w:spacing w:before="120" w:after="120"/>
+        <w:ind w:left="283" w:right="283"/>
+      </w:pPr>
       <w:r>
         <w:rPr>
           <w:rFonts w:ascii="Arial" w:hAnsi="Arial"/>
@@ -607,502 +1084,7 @@
           <w:color w:val="7A5C10"/>
           <w:sz w:val="20"/>
         </w:rPr>
-        <w:t xml:space="preserve">  Key finding: Setting a fixed R:R target on pairs (e.g. 1:1) produces Net −15.0R over 32 months. Using DXY-exit timing produces Net +80.1R. The DXY-exit approach is non-negotiable.</w:t>
-      </w:r>
-    </w:p>
-    <w:p>
-      <w:pPr>
-        <w:pBdr>
-          <w:bottom w:val="single" w:sz="4" w:space="1" w:color="DDDDDD"/>
-        </w:pBdr>
-        <w:spacing w:before="120" w:after="120"/>
-      </w:pPr>
-    </w:p>
-    <w:p>
-      <w:pPr>
-        <w:pBdr>
-          <w:bottom w:val="single" w:sz="6" w:space="4" w:color="C9A02C"/>
-        </w:pBdr>
-        <w:spacing w:before="360" w:after="80"/>
-      </w:pPr>
-      <w:r>
-        <w:rPr>
-          <w:rFonts w:ascii="Arial" w:hAnsi="Arial"/>
-          <w:b/>
-          <w:color w:val="1A375E"/>
-          <w:sz w:val="32"/>
-        </w:rPr>
-        <w:t>SECTION 2 — HOW THE INDICATORS WORK</w:t>
-      </w:r>
-    </w:p>
-    <w:p>
-      <w:pPr>
-        <w:spacing w:before="240" w:after="60"/>
-      </w:pPr>
-      <w:r>
-        <w:rPr>
-          <w:rFonts w:ascii="Arial" w:hAnsi="Arial"/>
-          <w:b/>
-          <w:color w:val="C9A02C"/>
-          <w:sz w:val="26"/>
-        </w:rPr>
-        <w:t>2.1  DXYTradeAlert.pine — The Signal Indicator</w:t>
-      </w:r>
-    </w:p>
-    <w:p>
-      <w:pPr>
-        <w:spacing w:after="120"/>
-      </w:pPr>
-      <w:r>
-        <w:rPr>
-          <w:rFonts w:ascii="Arial" w:hAnsi="Arial"/>
-          <w:color w:val="1A1A1A"/>
-        </w:rPr>
-        <w:t>Applied to the DXY 15-minute chart on TradingView. This is the primary indicator you watch every day.</w:t>
-      </w:r>
-    </w:p>
-    <w:p>
-      <w:pPr>
-        <w:spacing w:before="160" w:after="40"/>
-      </w:pPr>
-      <w:r>
-        <w:rPr>
-          <w:rFonts w:ascii="Arial" w:hAnsi="Arial"/>
-          <w:b/>
-          <w:color w:val="1A375E"/>
-        </w:rPr>
-        <w:t>What it draws on the chart</w:t>
-      </w:r>
-    </w:p>
-    <w:p>
-      <w:pPr>
-        <w:pStyle w:val="ListBullet"/>
-        <w:spacing w:before="20" w:after="40"/>
-        <w:ind w:left="340"/>
-      </w:pPr>
-      <w:r>
-        <w:rPr>
-          <w:rFonts w:ascii="Arial" w:hAnsi="Arial"/>
-          <w:color w:val="1A1A1A"/>
-          <w:sz w:val="21"/>
-        </w:rPr>
-        <w:t>Yellow horizontal line — London session opening price (07:00 UTC each day, 06:30 UTC Monday).</w:t>
-      </w:r>
-    </w:p>
-    <w:p>
-      <w:pPr>
-        <w:pStyle w:val="ListBullet"/>
-        <w:spacing w:before="20" w:after="40"/>
-        <w:ind w:left="340"/>
-      </w:pPr>
-      <w:r>
-        <w:rPr>
-          <w:rFonts w:ascii="Arial" w:hAnsi="Arial"/>
-          <w:color w:val="1A1A1A"/>
-          <w:sz w:val="21"/>
-        </w:rPr>
-        <w:t>Dashed red line — prior calendar day high (structural SL reference for REV SHORT).</w:t>
-      </w:r>
-    </w:p>
-    <w:p>
-      <w:pPr>
-        <w:pStyle w:val="ListBullet"/>
-        <w:spacing w:before="20" w:after="40"/>
-        <w:ind w:left="340"/>
-      </w:pPr>
-      <w:r>
-        <w:rPr>
-          <w:rFonts w:ascii="Arial" w:hAnsi="Arial"/>
-          <w:color w:val="1A1A1A"/>
-          <w:sz w:val="21"/>
-        </w:rPr>
-        <w:t>Dashed green line — prior calendar day low (structural SL reference for REV LONG).</w:t>
-      </w:r>
-    </w:p>
-    <w:p>
-      <w:pPr>
-        <w:pStyle w:val="ListBullet"/>
-        <w:spacing w:before="20" w:after="40"/>
-        <w:ind w:left="340"/>
-      </w:pPr>
-      <w:r>
-        <w:rPr>
-          <w:rFonts w:ascii="Arial" w:hAnsi="Arial"/>
-          <w:color w:val="1A1A1A"/>
-          <w:sz w:val="21"/>
-        </w:rPr>
-        <w:t>Green/Red box — Tokyo gap zone (gap between 23:15 UTC reference close and 23:45 UTC open). Green = gap-down pristine. Red = gap-up pristine. Grey = gap has been touched/filled.</w:t>
-      </w:r>
-    </w:p>
-    <w:p>
-      <w:pPr>
-        <w:pStyle w:val="ListBullet"/>
-        <w:spacing w:before="20" w:after="40"/>
-        <w:ind w:left="340"/>
-      </w:pPr>
-      <w:r>
-        <w:rPr>
-          <w:rFonts w:ascii="Arial" w:hAnsi="Arial"/>
-          <w:color w:val="1A1A1A"/>
-          <w:sz w:val="21"/>
-        </w:rPr>
-        <w:lastRenderedPageBreak/>
-        <w:t>Yellow box — LON_ATTR zone (body of the London open candle). Yellow = pristine/untouched. Grey = violated.</w:t>
-      </w:r>
-    </w:p>
-    <w:p>
-      <w:pPr>
-        <w:pStyle w:val="ListBullet"/>
-        <w:spacing w:before="20" w:after="40"/>
-        <w:ind w:left="340"/>
-      </w:pPr>
-      <w:r>
-        <w:rPr>
-          <w:rFonts w:ascii="Arial" w:hAnsi="Arial"/>
-          <w:color w:val="1A1A1A"/>
-          <w:sz w:val="21"/>
-        </w:rPr>
-        <w:t>Orange background fill — active when 4H Bollinger Bands are flat (GAP_REJ/ATTR_CORE conditions allowed).</w:t>
-      </w:r>
-    </w:p>
-    <w:p>
-      <w:pPr>
-        <w:pStyle w:val="ListBullet"/>
-        <w:spacing w:before="20" w:after="40"/>
-        <w:ind w:left="340"/>
-      </w:pPr>
-      <w:r>
-        <w:rPr>
-          <w:rFonts w:ascii="Arial" w:hAnsi="Arial"/>
-          <w:color w:val="1A1A1A"/>
-          <w:sz w:val="21"/>
-        </w:rPr>
-        <w:t>Signal labels — appear above (▼ SHORT) or below (▲ LONG) the signal candle at bar close.</w:t>
-      </w:r>
-    </w:p>
-    <w:p>
-      <w:pPr>
-        <w:pStyle w:val="ListBullet"/>
-        <w:spacing w:before="20" w:after="40"/>
-        <w:ind w:left="340"/>
-      </w:pPr>
-      <w:r>
-        <w:rPr>
-          <w:rFonts w:ascii="Arial" w:hAnsi="Arial"/>
-          <w:color w:val="1A1A1A"/>
-          <w:sz w:val="21"/>
-        </w:rPr>
-        <w:t>TP and SL lines — drawn at the time of each signal, showing exact price levels.</w:t>
-      </w:r>
-    </w:p>
-    <w:p>
-      <w:pPr>
-        <w:spacing w:before="160" w:after="40"/>
-      </w:pPr>
-      <w:r>
-        <w:rPr>
-          <w:rFonts w:ascii="Arial" w:hAnsi="Arial"/>
-          <w:b/>
-          <w:color w:val="1A375E"/>
-        </w:rPr>
-        <w:t>What it calculates in the background</w:t>
-      </w:r>
-    </w:p>
-    <w:p>
-      <w:pPr>
-        <w:pStyle w:val="ListBullet"/>
-        <w:spacing w:before="20" w:after="40"/>
-        <w:ind w:left="340"/>
-      </w:pPr>
-      <w:r>
-        <w:rPr>
-          <w:rFonts w:ascii="Arial" w:hAnsi="Arial"/>
-          <w:color w:val="1A1A1A"/>
-          <w:sz w:val="21"/>
-        </w:rPr>
-        <w:t>4H and 1H Bollinger Band regime (+1 bullish expansion / −1 bearish expansion / 0 flat).</w:t>
-      </w:r>
-    </w:p>
-    <w:p>
-      <w:pPr>
-        <w:pStyle w:val="ListBullet"/>
-        <w:spacing w:before="20" w:after="40"/>
-        <w:ind w:left="340"/>
-      </w:pPr>
-      <w:r>
-        <w:rPr>
-          <w:rFonts w:ascii="Arial" w:hAnsi="Arial"/>
-          <w:color w:val="1A1A1A"/>
-          <w:sz w:val="21"/>
-        </w:rPr>
-        <w:t>Tokyo gap size in pts: (23:45 open − 23:15 close) × 10,000.</w:t>
-      </w:r>
-    </w:p>
-    <w:p>
-      <w:pPr>
-        <w:pStyle w:val="ListBullet"/>
-        <w:spacing w:before="20" w:after="40"/>
-        <w:ind w:left="340"/>
-      </w:pPr>
-      <w:r>
-        <w:rPr>
-          <w:rFonts w:ascii="Arial" w:hAnsi="Arial"/>
-          <w:color w:val="1A1A1A"/>
-          <w:sz w:val="21"/>
-        </w:rPr>
-        <w:t>Whether the gap has been touched this session (attr_gap_touched flag).</w:t>
-      </w:r>
-    </w:p>
-    <w:p>
-      <w:pPr>
-        <w:pStyle w:val="ListBullet"/>
-        <w:spacing w:before="20" w:after="40"/>
-        <w:ind w:left="340"/>
-      </w:pPr>
-      <w:r>
-        <w:rPr>
-          <w:rFonts w:ascii="Arial" w:hAnsi="Arial"/>
-          <w:color w:val="1A1A1A"/>
-          <w:sz w:val="21"/>
-        </w:rPr>
-        <w:t>Gap size at the moment London opened (CORE filter 1).</w:t>
-      </w:r>
-    </w:p>
-    <w:p>
-      <w:pPr>
-        <w:pStyle w:val="ListBullet"/>
-        <w:spacing w:before="20" w:after="40"/>
-        <w:ind w:left="340"/>
-      </w:pPr>
-      <w:r>
-        <w:rPr>
-          <w:rFonts w:ascii="Arial" w:hAnsi="Arial"/>
-          <w:color w:val="1A1A1A"/>
-          <w:sz w:val="21"/>
-        </w:rPr>
-        <w:t>Wave extension since London open (CORE filter 2).</w:t>
-      </w:r>
-    </w:p>
-    <w:p>
-      <w:pPr>
-        <w:pStyle w:val="ListBullet"/>
-        <w:spacing w:before="20" w:after="40"/>
-        <w:ind w:left="340"/>
-      </w:pPr>
-      <w:r>
-        <w:rPr>
-          <w:rFonts w:ascii="Arial" w:hAnsi="Arial"/>
-          <w:color w:val="1A1A1A"/>
-          <w:sz w:val="21"/>
-        </w:rPr>
-        <w:t>Maximum up/down move from the London open level this session (for REV detection).</w:t>
-      </w:r>
-    </w:p>
-    <w:p>
-      <w:pPr>
-        <w:spacing w:before="160" w:after="40"/>
-      </w:pPr>
-      <w:r>
-        <w:rPr>
-          <w:rFonts w:ascii="Arial" w:hAnsi="Arial"/>
-          <w:b/>
-          <w:color w:val="1A375E"/>
-        </w:rPr>
-        <w:t>When it fires an alert</w:t>
-      </w:r>
-    </w:p>
-    <w:p>
-      <w:pPr>
-        <w:spacing w:after="120"/>
-      </w:pPr>
-      <w:r>
-        <w:rPr>
-          <w:rFonts w:ascii="Arial" w:hAnsi="Arial"/>
-          <w:color w:val="1A1A1A"/>
-        </w:rPr>
-        <w:t>All signals fire only at the close of a 15-minute candle (barstate.isconfirmed). Signals never appear mid-candle and cannot "disappear" during candle formation.</w:t>
-      </w:r>
-    </w:p>
-    <w:p>
-      <w:pPr>
-        <w:spacing w:before="240" w:after="60"/>
-      </w:pPr>
-      <w:r>
-        <w:rPr>
-          <w:rFonts w:ascii="Arial" w:hAnsi="Arial"/>
-          <w:b/>
-          <w:color w:val="C9A02C"/>
-          <w:sz w:val="26"/>
-        </w:rPr>
-        <w:t>2.2  DXYPairLevels.pine — The Pair Entry/Exit Indicator</w:t>
-      </w:r>
-    </w:p>
-    <w:p>
-      <w:pPr>
-        <w:spacing w:after="120"/>
-      </w:pPr>
-      <w:r>
-        <w:rPr>
-          <w:rFonts w:ascii="Arial" w:hAnsi="Arial"/>
-          <w:color w:val="1A1A1A"/>
-        </w:rPr>
-        <w:t>Applied to any of the 8 supported pair charts (15-minute timeframe) on TradingView. It reads DXY data in the background using request.security and converts signal levels to the pair's price scale.</w:t>
-      </w:r>
-    </w:p>
-    <w:p>
-      <w:pPr>
-        <w:spacing w:before="160" w:after="40"/>
-      </w:pPr>
-      <w:r>
-        <w:rPr>
-          <w:rFonts w:ascii="Arial" w:hAnsi="Arial"/>
-          <w:b/>
-          <w:color w:val="1A375E"/>
-        </w:rPr>
-        <w:t>What it draws on the pair chart</w:t>
-      </w:r>
-    </w:p>
-    <w:p>
-      <w:pPr>
-        <w:pStyle w:val="ListBullet"/>
-        <w:spacing w:before="20" w:after="40"/>
-        <w:ind w:left="340"/>
-      </w:pPr>
-      <w:r>
-        <w:rPr>
-          <w:rFonts w:ascii="Arial" w:hAnsi="Arial"/>
-          <w:color w:val="1A1A1A"/>
-          <w:sz w:val="21"/>
-        </w:rPr>
-        <w:t>Entry label (▲ below bar for long, ▼ above bar for short) at the moment DXY fires a signal.</w:t>
-      </w:r>
-    </w:p>
-    <w:p>
-      <w:pPr>
-        <w:pStyle w:val="ListBullet"/>
-        <w:spacing w:before="20" w:after="40"/>
-        <w:ind w:left="340"/>
-      </w:pPr>
-      <w:r>
-        <w:rPr>
-          <w:rFonts w:ascii="Arial" w:hAnsi="Arial"/>
-          <w:color w:val="1A1A1A"/>
-          <w:sz w:val="21"/>
-        </w:rPr>
-        <w:t>Green dashed TP line — estimated pair TP (derived from DXY TP level via tick_factor conversion).</w:t>
-      </w:r>
-    </w:p>
-    <w:p>
-      <w:pPr>
-        <w:pStyle w:val="ListBullet"/>
-        <w:spacing w:before="20" w:after="40"/>
-        <w:ind w:left="340"/>
-      </w:pPr>
-      <w:r>
-        <w:rPr>
-          <w:rFonts w:ascii="Arial" w:hAnsi="Arial"/>
-          <w:color w:val="1A1A1A"/>
-          <w:sz w:val="21"/>
-        </w:rPr>
-        <w:t>Red dashed SL line — estimated pair SL (hard-stop placement reference).</w:t>
-      </w:r>
-    </w:p>
-    <w:p>
-      <w:pPr>
-        <w:spacing w:before="160" w:after="40"/>
-      </w:pPr>
-      <w:r>
-        <w:rPr>
-          <w:rFonts w:ascii="Arial" w:hAnsi="Arial"/>
-          <w:b/>
-          <w:color w:val="1A375E"/>
-        </w:rPr>
-        <w:t>Key behaviours</w:t>
-      </w:r>
-    </w:p>
-    <w:p>
-      <w:pPr>
-        <w:pStyle w:val="ListBullet"/>
-        <w:spacing w:before="20" w:after="40"/>
-        <w:ind w:left="340"/>
-      </w:pPr>
-      <w:r>
-        <w:rPr>
-          <w:rFonts w:ascii="Arial" w:hAnsi="Arial"/>
-          <w:color w:val="1A1A1A"/>
-          <w:sz w:val="21"/>
-        </w:rPr>
-        <w:t>Auto-detects the pair from the chart symbol — no manual configuration needed when switching pairs.</w:t>
-      </w:r>
-    </w:p>
-    <w:p>
-      <w:pPr>
-        <w:pStyle w:val="ListBullet"/>
-        <w:spacing w:before="20" w:after="40"/>
-        <w:ind w:left="340"/>
-      </w:pPr>
-      <w:r>
-        <w:rPr>
-          <w:rFonts w:ascii="Arial" w:hAnsi="Arial"/>
-          <w:color w:val="1A1A1A"/>
-          <w:sz w:val="21"/>
-        </w:rPr>
-        <w:t>Auto-determines trade direction from DXY signal direction + pair type (USD base vs USD quote).</w:t>
-      </w:r>
-    </w:p>
-    <w:p>
-      <w:pPr>
-        <w:pStyle w:val="ListBullet"/>
-        <w:spacing w:before="20" w:after="40"/>
-        <w:ind w:left="340"/>
-      </w:pPr>
-      <w:r>
-        <w:rPr>
-          <w:rFonts w:ascii="Arial" w:hAnsi="Arial"/>
-          <w:color w:val="1A1A1A"/>
-          <w:sz w:val="21"/>
-        </w:rPr>
-        <w:t>Fires webhook JSON alerts compatible with broker automation (e.g. 3Commas, Alertatron).</w:t>
-      </w:r>
-    </w:p>
-    <w:p>
-      <w:pPr>
-        <w:pStyle w:val="ListBullet"/>
-        <w:spacing w:before="20" w:after="40"/>
-        <w:ind w:left="340"/>
-      </w:pPr>
-      <w:r>
-        <w:rPr>
-          <w:rFonts w:ascii="Arial" w:hAnsi="Arial"/>
-          <w:color w:val="1A1A1A"/>
-          <w:sz w:val="21"/>
-        </w:rPr>
-        <w:t>Signals fire at bar close only (barstate.isconfirmed) — consistent with DXYTradeAlert.</w:t>
-      </w:r>
-    </w:p>
-    <w:p>
-      <w:pPr>
-        <w:shd w:val="clear" w:color="auto" w:fill="FFF8E7"/>
-        <w:spacing w:before="120" w:after="120"/>
-        <w:ind w:left="283" w:right="283"/>
-      </w:pPr>
-      <w:r>
-        <w:rPr>
-          <w:rFonts w:ascii="Arial" w:hAnsi="Arial"/>
-          <w:i/>
-          <w:color w:val="7A5C10"/>
-          <w:sz w:val="20"/>
-        </w:rPr>
-        <w:t>ℹ</w:t>
-      </w:r>
-      <w:r>
-        <w:rPr>
-          <w:rFonts w:ascii="Arial" w:hAnsi="Arial"/>
-          <w:i/>
-          <w:color w:val="7A5C10"/>
-          <w:sz w:val="20"/>
-        </w:rPr>
-        <w:t xml:space="preserve">  IMPORTANT: Never access TradingView directly to apply or modify these indicators — log in manually and apply .pine source code yourself. TradingView has bot detection that can flag automated access.</w:t>
+        <w:t>ℹ  IMPORTANT: Never access TradingView directly to apply or modify these indicators — log in manually and apply .pine source code yourself. TradingView has bot detection that can flag automated access.</w:t>
       </w:r>
     </w:p>
     <w:p>
@@ -2737,16 +2719,7 @@
           <w:color w:val="7A5C10"/>
           <w:sz w:val="20"/>
         </w:rPr>
-        <w:t>ℹ</w:t>
-      </w:r>
-      <w:r>
-        <w:rPr>
-          <w:rFonts w:ascii="Arial" w:hAnsi="Arial"/>
-          <w:i/>
-          <w:color w:val="7A5C10"/>
-          <w:sz w:val="20"/>
-        </w:rPr>
-        <w:t xml:space="preserve">  DXYPairLevels.pine performs this conversion automatically and draws the SL line directly on the pair chart. You do not need to calculate this manually in live trading.</w:t>
+        <w:t>ℹ  DXYPairLevels.pine performs this conversion automatically and draws the SL line directly on the pair chart. You do not need to calculate this manually in live trading.</w:t>
       </w:r>
     </w:p>
     <w:p>
@@ -3671,16 +3644,7 @@
           <w:color w:val="7A5C10"/>
           <w:sz w:val="20"/>
         </w:rPr>
-        <w:t>ℹ</w:t>
-      </w:r>
-      <w:r>
-        <w:rPr>
-          <w:rFonts w:ascii="Arial" w:hAnsi="Arial"/>
-          <w:i/>
-          <w:color w:val="7A5C10"/>
-          <w:sz w:val="20"/>
-        </w:rPr>
-        <w:t xml:space="preserve">  LON_ATTR trade type accepts pin bars ONLY — engulfing candles and 3-bar reversals are excluded for this trade type.</w:t>
+        <w:t>ℹ  LON_ATTR trade type accepts pin bars ONLY — engulfing candles and 3-bar reversals are excluded for this trade type.</w:t>
       </w:r>
     </w:p>
     <w:p>
@@ -3959,7 +3923,7 @@
                 <w:color w:val="1A1A1A"/>
                 <w:sz w:val="19"/>
               </w:rPr>
-              <w:t>Gap at Tokyo open has already been filled. Trade fades the pullback away from the filled gap.</w:t>
+              <w:t>Gap at Tokyo open is filled; trade fades the pullback. v2.0: split into GAP_REJ_LONG (DXY indicator, USDJPY+NZDUSD) and GAP_REJ_SHORT (USDJPY indicator, EURUSD+GBPUSD+USDCHF).</w:t>
             </w:r>
           </w:p>
         </w:tc>
@@ -4002,7 +3966,7 @@
                 <w:color w:val="1A1A1A"/>
                 <w:sz w:val="19"/>
               </w:rPr>
-              <w:t>Tokyo gap ≥ 75 pts AND gap has been touched/filled (green/red box turns grey).</w:t>
+              <w:t>LONG: Tokyo gap ≥ 75 pts filled, on USDJPY or NZDUSD only · SHORT: USDJPY gap ≥ 200 pts filled, on EURUSD/GBPUSD/USDCHF only.</w:t>
             </w:r>
           </w:p>
         </w:tc>
@@ -4088,7 +4052,7 @@
                 <w:color w:val="1A1A1A"/>
                 <w:sz w:val="19"/>
               </w:rPr>
-              <w:t>Gap target (23:15 UTC close) ± 50 pt near-edge buffer.</w:t>
+              <w:t>GAP_REJ_LONG: 1.0× DXY SL distance (1:1 R:R). GAP_REJ_SHORT: 3.0× USDJPY SL distance. Exit when respective indicator hits TP.</w:t>
             </w:r>
           </w:p>
         </w:tc>
@@ -4174,7 +4138,7 @@
                 <w:color w:val="1A1A1A"/>
                 <w:sz w:val="19"/>
               </w:rPr>
-              <w:t>1:1 on DXY. Uncapped on pairs (average +2.58R per winning pair trade).</w:t>
+              <w:t>GAP_REJ_LONG: 1:1 on DXY. GAP_REJ_SHORT: 3:1 on USDJPY. Both uncapped on pairs.</w:t>
             </w:r>
           </w:p>
         </w:tc>
@@ -4260,7 +4224,7 @@
                 <w:color w:val="1A1A1A"/>
                 <w:sz w:val="19"/>
               </w:rPr>
-              <w:t>4H Bollinger Bands must be FLAT (regime = 0). No trending market.</w:t>
+              <w:t>No BB regime filter required for GAP_REJ in v2.0 (removed — not a reliable filter for this signal type).</w:t>
             </w:r>
           </w:p>
         </w:tc>
@@ -4534,7 +4498,7 @@
                 <w:color w:val="1A1A1A"/>
                 <w:sz w:val="19"/>
               </w:rPr>
-              <w:t>DXY moves away from the London open price by ≥ 400 pts, then returns. Trade fires at the opening level on return.</w:t>
+              <w:t>USDJPY moves ≥ 1,000 pts (impulse) from London open, then returns within 1,000 pts (LONG) or 5,000 pts (SHORT). Signal fires as USDJPY approaches the London open level. TP multiplier: 3.0× (LONG) / 2.5× (SHORT).</w:t>
             </w:r>
           </w:p>
         </w:tc>
@@ -4577,7 +4541,7 @@
                 <w:color w:val="1A1A1A"/>
                 <w:sz w:val="19"/>
               </w:rPr>
-              <w:t>Price has moved ≥ 400 pts away AND returned to within 250 pts of opening level.</w:t>
+              <w:t>REV_LONG: USDJPY impulse ≥ 1,000 pts AND return within 1,000 pts of London open · REV_SHORT: USDJPY impulse ≥ 1,000 pts AND return within 5,000 pts of London open.</w:t>
             </w:r>
           </w:p>
         </w:tc>
@@ -4663,7 +4627,7 @@
                 <w:color w:val="1A1A1A"/>
                 <w:sz w:val="19"/>
               </w:rPr>
-              <w:t>1:1 R:R from entry. TP = entry + SL distance (long) / entry − SL distance (short).</w:t>
+              <w:t>REV_LONG: 3.0× USDJPY SL distance from entry. REV_SHORT: 2.5× USDJPY SL distance. Exit when USDJPY hits TP level.</w:t>
             </w:r>
           </w:p>
         </w:tc>
@@ -4749,7 +4713,7 @@
                 <w:color w:val="1A1A1A"/>
                 <w:sz w:val="19"/>
               </w:rPr>
-              <w:t>1:1 on DXY. Uncapped on pairs.</w:t>
+              <w:t>REV_LONG 3:1 · REV_SHORT 2.5:1 on USDJPY. Uncapped on pairs.</w:t>
             </w:r>
           </w:p>
         </w:tc>
@@ -4836,7 +4800,7 @@
                 <w:color w:val="1A1A1A"/>
                 <w:sz w:val="19"/>
               </w:rPr>
-              <w:t>1H BB AND 4H BB must BOTH be expanding in the trade direction. Mixed = no trade.</w:t>
+              <w:t>REV_LONG: 4H BB flat required (BB4 regime = 0). REV_SHORT: no BB filter (any regime). Both use USDJPY as indicator.</w:t>
             </w:r>
           </w:p>
         </w:tc>
@@ -4929,16 +4893,7 @@
           <w:color w:val="7A5C10"/>
           <w:sz w:val="20"/>
         </w:rPr>
-        <w:t>ℹ</w:t>
-      </w:r>
-      <w:r>
-        <w:rPr>
-          <w:rFonts w:ascii="Arial" w:hAnsi="Arial"/>
-          <w:i/>
-          <w:color w:val="7A5C10"/>
-          <w:sz w:val="20"/>
-        </w:rPr>
-        <w:t xml:space="preserve">  REV is the highest-volume trade type and the primary return driver. XAUUSD REV has 91.7% win rate over 32 months. USDCAD REV has 75.0% win rate.</w:t>
+        <w:t>ℹ  REV is the highest-volume trade type and the primary return driver. XAUUSD REV has 91.7% win rate over 32 months. USDCAD REV has 75.0% win rate.</w:t>
       </w:r>
     </w:p>
     <w:p>
@@ -5264,7 +5219,7 @@
                 <w:color w:val="1A1A1A"/>
                 <w:sz w:val="19"/>
               </w:rPr>
-              <w:t>1:1 on DXY. Uncapped on pairs.</w:t>
+              <w:t>DXY indicator (LONG only). TP per pair: USDJPY 2.5× · NZDUSD/AUDUSD 1.5×. Pairs restricted to USDJPY, NZDUSD, AUDUSD only.</w:t>
             </w:r>
           </w:p>
         </w:tc>
@@ -5470,7 +5425,7 @@
           <w:color w:val="1A1A1A"/>
           <w:sz w:val="21"/>
         </w:rPr>
-        <w:t>The body of the London open candle represents the opening "fair value" range. When price moves far from this zone and a pin bar rejection forms, the zone acts as a magnetic target. The "pristine" requirement means no candle has yet breached the zone edge — institutional interest is still untested. LON_ATTR is the highest-returning signal per trade count: +95.1R across 83 trades.</w:t>
+        <w:t>The body of the London open candle represents the opening "fair value" range. When price moves far from this zone and a pin bar rejection forms, the zone acts as a magnetic target. The "pristine" requirement means no candle has yet breached the zone edge — institutional interest is still untested. LON_ATTR_LONG is the highest-returning signal in v2.0: +135.0R across 193 trades (restricted to USDJPY, NZDUSD, AUDUSD).</w:t>
       </w:r>
     </w:p>
     <w:p>
@@ -5711,13 +5666,6 @@
                 <w:sz w:val="19"/>
               </w:rPr>
               <w:t xml:space="preserve">Wave extension ≤ 1,500 pts (DXY has not moved &gt;1,500 pts further away since </w:t>
-            </w:r>
-            <w:r>
-              <w:rPr>
-                <w:rFonts w:ascii="Arial" w:hAnsi="Arial"/>
-                <w:color w:val="1A1A1A"/>
-                <w:sz w:val="19"/>
-              </w:rPr>
               <w:lastRenderedPageBreak/>
               <w:t>London open).</w:t>
             </w:r>
@@ -5849,7 +5797,7 @@
                 <w:color w:val="1A1A1A"/>
                 <w:sz w:val="19"/>
               </w:rPr>
-              <w:t>Gap target ± 50 pt near-edge buffer (same as GAP_REJ).</w:t>
+              <w:t>ATTR_CORE_LONG: 3.0× USDJPY SL distance. ATTR_CORE_SHORT: 2.5× USDJPY SL distance. Exit when USDJPY hits TP level.</w:t>
             </w:r>
           </w:p>
         </w:tc>
@@ -5935,7 +5883,7 @@
                 <w:color w:val="1A1A1A"/>
                 <w:sz w:val="19"/>
               </w:rPr>
-              <w:t>1:1 on DXY. Uncapped on pairs.</w:t>
+              <w:t>ATTR_CORE_LONG 3:1 · ATTR_CORE_SHORT 2.5:1 on USDJPY. Uncapped on pairs.</w:t>
             </w:r>
           </w:p>
         </w:tc>
@@ -6064,7 +6012,7 @@
                 <w:color w:val="1A1A1A"/>
                 <w:sz w:val="19"/>
               </w:rPr>
-              <w:t>XAUUSD: DXY LONG signals only (66.7% WR). All others: DXY SHORT signals only (68.6% WR).</w:t>
+              <w:t>ATTR_CORE_SHORT: 4H BB flat required (regime = 0). ATTR_CORE_LONG: any regime accepted. USDJPY indicator for both. XAUUSD excluded in v2.0.</w:t>
             </w:r>
           </w:p>
         </w:tc>
@@ -6200,16 +6148,7 @@
           <w:color w:val="7A5C10"/>
           <w:sz w:val="20"/>
         </w:rPr>
-        <w:t>ℹ</w:t>
-      </w:r>
-      <w:r>
-        <w:rPr>
-          <w:rFonts w:ascii="Arial" w:hAnsi="Arial"/>
-          <w:i/>
-          <w:color w:val="7A5C10"/>
-          <w:sz w:val="20"/>
-        </w:rPr>
-        <w:t xml:space="preserve">  ATTR_CORE has the highest win rate of any signal type: 70.2% overall. The unfiltered version (no CORE filters) was consistently unprofitable at −9.5R. Never trade ATTR without both CORE filters passing.</w:t>
+        <w:t>ℹ  ATTR_CORE has the highest win rate of any signal type: 70.2% overall. The unfiltered version (no CORE filters) was consistently unprofitable at −9.5R. Never trade ATTR without both CORE filters passing.</w:t>
       </w:r>
     </w:p>
     <w:p>
@@ -6363,86 +6302,44 @@
           <w:sz w:val="21"/>
         </w:rPr>
         <w:t>Check the 4H Bollinger Band status on the chart:</w:t>
-      </w:r>
+        <w:br/>
+        <w:t xml:space="preserve">   → Orange background = 4H BB flat = GAP_REJ and ATTR_CORE conditions may be met today.</w:t>
+        <w:br/>
+        <w:t xml:space="preserve">   → No orange background = 4H BB expanding = REV conditions may be met today.</w:t>
+      </w:r>
+    </w:p>
+    <w:p>
+      <w:pPr>
+        <w:pStyle w:val="ListNumber"/>
+        <w:spacing w:before="20" w:after="40"/>
+        <w:ind w:left="340"/>
+      </w:pPr>
       <w:r>
         <w:rPr>
           <w:rFonts w:ascii="Arial" w:hAnsi="Arial"/>
           <w:color w:val="1A1A1A"/>
           <w:sz w:val="21"/>
         </w:rPr>
-        <w:br/>
-      </w:r>
+        <w:t>Check the 1H chart separately for BB regime if anticipating a REV setup.</w:t>
+      </w:r>
+    </w:p>
+    <w:p>
+      <w:pPr>
+        <w:pStyle w:val="ListNumber"/>
+        <w:spacing w:before="20" w:after="40"/>
+        <w:ind w:left="340"/>
+      </w:pPr>
       <w:r>
         <w:rPr>
           <w:rFonts w:ascii="Arial" w:hAnsi="Arial"/>
           <w:color w:val="1A1A1A"/>
           <w:sz w:val="21"/>
         </w:rPr>
-        <w:t xml:space="preserve">   → Orange background = 4H BB flat = GAP_REJ and ATTR_CORE conditions may be met today.</w:t>
-      </w:r>
-      <w:r>
-        <w:rPr>
-          <w:rFonts w:ascii="Arial" w:hAnsi="Arial"/>
-          <w:color w:val="1A1A1A"/>
-          <w:sz w:val="21"/>
-        </w:rPr>
-        <w:br/>
-        <w:t xml:space="preserve">   → No orange background = 4H BB expanding = REV conditions may be met today.</w:t>
-      </w:r>
-    </w:p>
-    <w:p>
-      <w:pPr>
-        <w:pStyle w:val="ListNumber"/>
-        <w:spacing w:before="20" w:after="40"/>
-        <w:ind w:left="340"/>
-      </w:pPr>
-      <w:r>
-        <w:rPr>
-          <w:rFonts w:ascii="Arial" w:hAnsi="Arial"/>
-          <w:color w:val="1A1A1A"/>
-          <w:sz w:val="21"/>
-        </w:rPr>
-        <w:t>Check the 1H chart separately for BB regime if anticipating a REV setup.</w:t>
-      </w:r>
-    </w:p>
-    <w:p>
-      <w:pPr>
-        <w:pStyle w:val="ListNumber"/>
-        <w:spacing w:before="20" w:after="40"/>
-        <w:ind w:left="340"/>
-      </w:pPr>
-      <w:r>
-        <w:rPr>
-          <w:rFonts w:ascii="Arial" w:hAnsi="Arial"/>
-          <w:color w:val="1A1A1A"/>
-          <w:sz w:val="21"/>
-        </w:rPr>
         <w:t>Note the Tokyo gap: look at the green/red box on the DXY chart.</w:t>
-      </w:r>
-      <w:r>
-        <w:rPr>
-          <w:rFonts w:ascii="Arial" w:hAnsi="Arial"/>
-          <w:color w:val="1A1A1A"/>
-          <w:sz w:val="21"/>
-        </w:rPr>
         <w:br/>
         <w:t xml:space="preserve">   → Green/Red box = gap is pristine = watch for ATTR_CORE during London.</w:t>
-      </w:r>
-      <w:r>
-        <w:rPr>
-          <w:rFonts w:ascii="Arial" w:hAnsi="Arial"/>
-          <w:color w:val="1A1A1A"/>
-          <w:sz w:val="21"/>
-        </w:rPr>
         <w:br/>
         <w:t xml:space="preserve">   → Grey box = gap has been touched = watch for GAP_REJ during London.</w:t>
-      </w:r>
-      <w:r>
-        <w:rPr>
-          <w:rFonts w:ascii="Arial" w:hAnsi="Arial"/>
-          <w:color w:val="1A1A1A"/>
-          <w:sz w:val="21"/>
-        </w:rPr>
         <w:br/>
         <w:t xml:space="preserve">   → No box = gap &lt; 75 pts = no gap setup today.</w:t>
       </w:r>
@@ -6504,31 +6401,10 @@
           <w:sz w:val="21"/>
         </w:rPr>
         <w:t>If anticipating REV: confirm the 1H and 4H BB are both expanding in the same direction.</w:t>
-      </w:r>
-      <w:r>
-        <w:rPr>
-          <w:rFonts w:ascii="Arial" w:hAnsi="Arial"/>
-          <w:color w:val="1A1A1A"/>
-          <w:sz w:val="21"/>
-        </w:rPr>
         <w:br/>
         <w:t xml:space="preserve">   → Both expanding up = REV LONG valid.</w:t>
-      </w:r>
-      <w:r>
-        <w:rPr>
-          <w:rFonts w:ascii="Arial" w:hAnsi="Arial"/>
-          <w:color w:val="1A1A1A"/>
-          <w:sz w:val="21"/>
-        </w:rPr>
         <w:br/>
         <w:t xml:space="preserve">   → Both expanding down = REV SHORT valid.</w:t>
-      </w:r>
-      <w:r>
-        <w:rPr>
-          <w:rFonts w:ascii="Arial" w:hAnsi="Arial"/>
-          <w:color w:val="1A1A1A"/>
-          <w:sz w:val="21"/>
-        </w:rPr>
         <w:br/>
         <w:t xml:space="preserve">   → Mixed or flat = no REV today.</w:t>
       </w:r>
@@ -6620,40 +6496,12 @@
           <w:sz w:val="21"/>
         </w:rPr>
         <w:t>When a label appears, verify:</w:t>
-      </w:r>
-      <w:r>
-        <w:rPr>
-          <w:rFonts w:ascii="Arial" w:hAnsi="Arial"/>
-          <w:color w:val="1A1A1A"/>
-          <w:sz w:val="21"/>
-        </w:rPr>
         <w:br/>
         <w:t xml:space="preserve">   a) The signal type (GAP_REJ / REV / LON_ATTR / ATTR_CORE) matches your anticipation.</w:t>
-      </w:r>
-      <w:r>
-        <w:rPr>
-          <w:rFonts w:ascii="Arial" w:hAnsi="Arial"/>
-          <w:color w:val="1A1A1A"/>
-          <w:sz w:val="21"/>
-        </w:rPr>
         <w:br/>
         <w:t xml:space="preserve">   b) The confirmation candle is clear and valid (not borderline).</w:t>
-      </w:r>
-      <w:r>
-        <w:rPr>
-          <w:rFonts w:ascii="Arial" w:hAnsi="Arial"/>
-          <w:color w:val="1A1A1A"/>
-          <w:sz w:val="21"/>
-        </w:rPr>
         <w:br/>
         <w:t xml:space="preserve">   c) The TP and SL lines are visible on the chart.</w:t>
-      </w:r>
-      <w:r>
-        <w:rPr>
-          <w:rFonts w:ascii="Arial" w:hAnsi="Arial"/>
-          <w:color w:val="1A1A1A"/>
-          <w:sz w:val="21"/>
-        </w:rPr>
         <w:br/>
         <w:t xml:space="preserve">   d) For pin bars: wick direction matches trade direction.</w:t>
       </w:r>
@@ -6716,22 +6564,8 @@
           <w:sz w:val="21"/>
         </w:rPr>
         <w:t>Calculate the SL price on the pair:</w:t>
-      </w:r>
-      <w:r>
-        <w:rPr>
-          <w:rFonts w:ascii="Arial" w:hAnsi="Arial"/>
-          <w:color w:val="1A1A1A"/>
-          <w:sz w:val="21"/>
-        </w:rPr>
         <w:br/>
         <w:t xml:space="preserve">   SL price = entry price ± (DXY SL pts ÷ 10,000 × tick_factor)</w:t>
-      </w:r>
-      <w:r>
-        <w:rPr>
-          <w:rFonts w:ascii="Arial" w:hAnsi="Arial"/>
-          <w:color w:val="1A1A1A"/>
-          <w:sz w:val="21"/>
-        </w:rPr>
         <w:br/>
         <w:t xml:space="preserve">   The DXYPairLevels indicator shows this as a dashed red line on the pair chart.</w:t>
       </w:r>
@@ -7576,16 +7410,7 @@
           <w:color w:val="7A5C10"/>
           <w:sz w:val="20"/>
         </w:rPr>
-        <w:t>ℹ</w:t>
-      </w:r>
-      <w:r>
-        <w:rPr>
-          <w:rFonts w:ascii="Arial" w:hAnsi="Arial"/>
-          <w:i/>
-          <w:color w:val="7A5C10"/>
-          <w:sz w:val="20"/>
-        </w:rPr>
-        <w:t xml:space="preserve">  Rule: Move SL to breakeven at 0.5R profit. Move SL to +0.5R at 1.0R profit. Beyond that, let DXY determine the exit.</w:t>
+        <w:t>ℹ  Rule: Move SL to breakeven at 0.5R profit. Move SL to +0.5R at 1.0R profit. Beyond that, let DXY determine the exit.</w:t>
       </w:r>
     </w:p>
     <w:p>
@@ -7767,7 +7592,7 @@
           <w:rFonts w:ascii="Arial" w:hAnsi="Arial"/>
           <w:color w:val="1A1A1A"/>
         </w:rPr>
-        <w:t>32.4-month backtest period: August 2023 – April 2026. Risk: 0.25% per trade per pair. Account size: £100,000 reference.</w:t>
+        <w:t>32.4-month backtest period: September 2023 – May 2026. Risk: 0.25% per trade per pair. 7 pairs (XAUUSD excluded in v2.0). Dual indicator: DXY + USDJPY.</w:t>
       </w:r>
     </w:p>
     <w:tbl>
@@ -7824,7 +7649,7 @@
                 <w:color w:val="FFFFFF"/>
                 <w:sz w:val="19"/>
               </w:rPr>
-              <w:t>DXY Win Rate</w:t>
+              <w:t>Indicator WR</w:t>
             </w:r>
           </w:p>
         </w:tc>
@@ -7933,7 +7758,7 @@
                 <w:color w:val="1A1A1A"/>
                 <w:sz w:val="19"/>
               </w:rPr>
-              <w:t>43.5%</w:t>
+              <w:t>38.7%</w:t>
             </w:r>
           </w:p>
         </w:tc>
@@ -7953,7 +7778,7 @@
                 <w:color w:val="1A1A1A"/>
                 <w:sz w:val="19"/>
               </w:rPr>
-              <w:t>+51.1R</w:t>
+              <w:t>+114.2R</w:t>
             </w:r>
           </w:p>
         </w:tc>
@@ -7973,7 +7798,7 @@
                 <w:color w:val="1A1A1A"/>
                 <w:sz w:val="19"/>
               </w:rPr>
-              <w:t>78</w:t>
+              <w:t>155</w:t>
             </w:r>
           </w:p>
         </w:tc>
@@ -7993,7 +7818,7 @@
                 <w:color w:val="1A1A1A"/>
                 <w:sz w:val="19"/>
               </w:rPr>
-              <w:t>Positive at pair level despite negative DXY WR</w:t>
+              <w:t>LONG (DXY, USDJPY+NZD): +15.4R · SHORT (USDJPY, EUR+GBP+CHF): +98.7R</w:t>
             </w:r>
           </w:p>
         </w:tc>
@@ -8016,7 +7841,7 @@
                 <w:color w:val="1A1A1A"/>
                 <w:sz w:val="19"/>
               </w:rPr>
-              <w:t>REV (best)</w:t>
+              <w:t>REV_LONG</w:t>
             </w:r>
           </w:p>
         </w:tc>
@@ -8036,7 +7861,7 @@
                 <w:color w:val="1A1A1A"/>
                 <w:sz w:val="19"/>
               </w:rPr>
-              <w:t>50.0%</w:t>
+              <w:t>69.4%</w:t>
             </w:r>
           </w:p>
         </w:tc>
@@ -8056,7 +7881,7 @@
                 <w:color w:val="1A1A1A"/>
                 <w:sz w:val="19"/>
               </w:rPr>
-              <w:t>+69.4R</w:t>
+              <w:t>+51.1R</w:t>
             </w:r>
           </w:p>
         </w:tc>
@@ -8076,7 +7901,7 @@
                 <w:color w:val="1A1A1A"/>
                 <w:sz w:val="19"/>
               </w:rPr>
-              <w:t>294</w:t>
+              <w:t>49</w:t>
             </w:r>
           </w:p>
         </w:tc>
@@ -8096,7 +7921,7 @@
                 <w:color w:val="1A1A1A"/>
                 <w:sz w:val="19"/>
               </w:rPr>
-              <w:t>Prox 250 pts — highest trade count</w:t>
+              <w:t>USDJPY indicator · BB4 flat regime · 3.0x TP · highest WR signal</w:t>
             </w:r>
           </w:p>
         </w:tc>
@@ -8119,7 +7944,7 @@
                 <w:color w:val="1A1A1A"/>
                 <w:sz w:val="19"/>
               </w:rPr>
-              <w:t>REV (filtered)</w:t>
+              <w:t>REV_SHORT</w:t>
             </w:r>
           </w:p>
         </w:tc>
@@ -8139,7 +7964,7 @@
                 <w:color w:val="1A1A1A"/>
                 <w:sz w:val="19"/>
               </w:rPr>
-              <w:t>68.2%</w:t>
+              <w:t>44.8%</w:t>
             </w:r>
           </w:p>
         </w:tc>
@@ -8159,7 +7984,7 @@
                 <w:color w:val="1A1A1A"/>
                 <w:sz w:val="19"/>
               </w:rPr>
-              <w:t>+55.9R</w:t>
+              <w:t>+76.2R</w:t>
             </w:r>
           </w:p>
         </w:tc>
@@ -8179,7 +8004,7 @@
                 <w:color w:val="1A1A1A"/>
                 <w:sz w:val="19"/>
               </w:rPr>
-              <w:t>85</w:t>
+              <w:t>357</w:t>
             </w:r>
           </w:p>
         </w:tc>
@@ -8199,7 +8024,7 @@
                 <w:color w:val="1A1A1A"/>
                 <w:sz w:val="19"/>
               </w:rPr>
-              <w:t>Prox 150 + move 400 — highest DXY WR</w:t>
+              <w:t>USDJPY indicator · any BB regime · 2.5x TP · highest trade frequency</w:t>
             </w:r>
           </w:p>
         </w:tc>
@@ -8242,7 +8067,7 @@
                 <w:color w:val="1A1A1A"/>
                 <w:sz w:val="19"/>
               </w:rPr>
-              <w:t>57.1%</w:t>
+              <w:t>38.3%</w:t>
             </w:r>
           </w:p>
         </w:tc>
@@ -8262,7 +8087,7 @@
                 <w:color w:val="1A1A1A"/>
                 <w:sz w:val="19"/>
               </w:rPr>
-              <w:t>+95.1R</w:t>
+              <w:t>+135.0R</w:t>
             </w:r>
           </w:p>
         </w:tc>
@@ -8282,7 +8107,7 @@
                 <w:color w:val="1A1A1A"/>
                 <w:sz w:val="19"/>
               </w:rPr>
-              <w:t>83</w:t>
+              <w:t>193</w:t>
             </w:r>
           </w:p>
         </w:tc>
@@ -8302,7 +8127,7 @@
                 <w:color w:val="1A1A1A"/>
                 <w:sz w:val="19"/>
               </w:rPr>
-              <w:t>Best return per trade — USDJPY &amp; XAUUSD dominate</w:t>
+              <w:t>DXY indicator · USDJPY/NZD/AUD pairs only · 2.5× (JPY) / 1.5× (NZD/AUD) TP</w:t>
             </w:r>
           </w:p>
         </w:tc>
@@ -8345,7 +8170,7 @@
                 <w:color w:val="1A1A1A"/>
                 <w:sz w:val="19"/>
               </w:rPr>
-              <w:t>70.2%</w:t>
+              <w:t>45.1%</w:t>
             </w:r>
           </w:p>
         </w:tc>
@@ -8365,7 +8190,7 @@
                 <w:color w:val="1A1A1A"/>
                 <w:sz w:val="19"/>
               </w:rPr>
-              <w:t>+65.46R</w:t>
+              <w:t>+43.7R</w:t>
             </w:r>
           </w:p>
         </w:tc>
@@ -8385,7 +8210,7 @@
                 <w:color w:val="1A1A1A"/>
                 <w:sz w:val="19"/>
               </w:rPr>
-              <w:t>—</w:t>
+              <w:t>182</w:t>
             </w:r>
           </w:p>
         </w:tc>
@@ -8405,7 +8230,7 @@
                 <w:color w:val="1A1A1A"/>
                 <w:sz w:val="19"/>
               </w:rPr>
-              <w:t>Highest win rate. XAUUSD DXY LONG only (66.7%); others DXY SHORT only (68.6%)</w:t>
+              <w:t>USDJPY indicator · LONG any regime 3.0x TP · SHORT BB4 flat 2.5x TP · XAUUSD excluded</w:t>
             </w:r>
           </w:p>
         </w:tc>
@@ -8448,7 +8273,7 @@
                 <w:color w:val="1A1A1A"/>
                 <w:sz w:val="19"/>
               </w:rPr>
-              <w:t>56.4%</w:t>
+              <w:t>43.8%</w:t>
             </w:r>
           </w:p>
         </w:tc>
@@ -8468,7 +8293,7 @@
                 <w:color w:val="1A1A1A"/>
                 <w:sz w:val="19"/>
               </w:rPr>
-              <w:t>+165.7R</w:t>
+              <w:t>+420.1R</w:t>
             </w:r>
           </w:p>
         </w:tc>
@@ -8488,7 +8313,7 @@
                 <w:color w:val="1A1A1A"/>
                 <w:sz w:val="19"/>
               </w:rPr>
-              <w:t>—</w:t>
+              <w:t>936</w:t>
             </w:r>
           </w:p>
         </w:tc>
@@ -8508,7 +8333,7 @@
                 <w:color w:val="1A1A1A"/>
                 <w:sz w:val="19"/>
               </w:rPr>
-              <w:t>Profit factor 1.68 · Ann. return ~15.3%</w:t>
+              <w:t>Profit factor 2.00 · 7 pairs (excl. XAUUSD) · Ann. return ~39%</w:t>
             </w:r>
           </w:p>
         </w:tc>
@@ -9035,16 +8860,7 @@
           <w:color w:val="7A5C10"/>
           <w:sz w:val="20"/>
         </w:rPr>
-        <w:t>ℹ</w:t>
-      </w:r>
-      <w:r>
-        <w:rPr>
-          <w:rFonts w:ascii="Arial" w:hAnsi="Arial"/>
-          <w:i/>
-          <w:color w:val="7A5C10"/>
-          <w:sz w:val="20"/>
-        </w:rPr>
-        <w:t xml:space="preserve">  Two independent professional traders backtested this strategy with no coordination over the same period and achieved near-identical results (~82% WR, 100+ net R). This strongly validates the structural edge of the London-open DXY approach.</w:t>
+        <w:t>ℹ  Two independent professional traders backtested this strategy with no coordination over the same period and achieved near-identical results (~82% WR, 100+ net R). This strongly validates the structural edge of the London-open DXY approach.</w:t>
       </w:r>
     </w:p>
     <w:p>
@@ -9574,15 +9390,25 @@
           <w:sz w:val="21"/>
         </w:rPr>
         <w:t>Open a terminal (command prompt / PowerShell) and navigate to the project folder:</w:t>
-      </w:r>
+        <w:br/>
+        <w:t xml:space="preserve">   cd "C:\Users\justi\OneDrive\Documents\Claude\Projects\DXY Backtesting"</w:t>
+      </w:r>
+    </w:p>
+    <w:p>
+      <w:pPr>
+        <w:pStyle w:val="ListNumber"/>
+        <w:spacing w:before="20" w:after="40"/>
+        <w:ind w:left="340"/>
+      </w:pPr>
       <w:r>
         <w:rPr>
           <w:rFonts w:ascii="Arial" w:hAnsi="Arial"/>
           <w:color w:val="1A1A1A"/>
           <w:sz w:val="21"/>
         </w:rPr>
+        <w:t>Run the main parameter sweep:</w:t>
         <w:br/>
-        <w:t xml:space="preserve">   cd "C:\Users\justi\OneDrive\Documents\Claude\Projects\DXY Backtesting"</w:t>
+        <w:t xml:space="preserve">   python test_parameter_sweep.py</w:t>
       </w:r>
     </w:p>
     <w:p>
@@ -9597,56 +9423,11 @@
           <w:color w:val="1A1A1A"/>
           <w:sz w:val="21"/>
         </w:rPr>
-        <w:t>Run the main parameter sweep:</w:t>
-      </w:r>
-      <w:r>
-        <w:rPr>
-          <w:rFonts w:ascii="Arial" w:hAnsi="Arial"/>
-          <w:color w:val="1A1A1A"/>
-          <w:sz w:val="21"/>
-        </w:rPr>
-        <w:br/>
-        <w:t xml:space="preserve">   python test_parameter_sweep.py</w:t>
-      </w:r>
-    </w:p>
-    <w:p>
-      <w:pPr>
-        <w:pStyle w:val="ListNumber"/>
-        <w:spacing w:before="20" w:after="40"/>
-        <w:ind w:left="340"/>
-      </w:pPr>
-      <w:r>
-        <w:rPr>
-          <w:rFonts w:ascii="Arial" w:hAnsi="Arial"/>
-          <w:color w:val="1A1A1A"/>
-          <w:sz w:val="21"/>
-        </w:rPr>
         <w:t>The script tests combinations of:</w:t>
-      </w:r>
-      <w:r>
-        <w:rPr>
-          <w:rFonts w:ascii="Arial" w:hAnsi="Arial"/>
-          <w:color w:val="1A1A1A"/>
-          <w:sz w:val="21"/>
-        </w:rPr>
         <w:br/>
         <w:t xml:space="preserve">   • attr_min_gap (Tokyo gap minimum threshold)</w:t>
-      </w:r>
-      <w:r>
-        <w:rPr>
-          <w:rFonts w:ascii="Arial" w:hAnsi="Arial"/>
-          <w:color w:val="1A1A1A"/>
-          <w:sz w:val="21"/>
-        </w:rPr>
         <w:br/>
         <w:t xml:space="preserve">   • rev_proximity (how close to London open before REV fires)</w:t>
-      </w:r>
-      <w:r>
-        <w:rPr>
-          <w:rFonts w:ascii="Arial" w:hAnsi="Arial"/>
-          <w:color w:val="1A1A1A"/>
-          <w:sz w:val="21"/>
-        </w:rPr>
         <w:br/>
         <w:t xml:space="preserve">   • rev_min_move (minimum move away from opening before return is valid)</w:t>
       </w:r>
@@ -10032,13 +9813,6 @@
                 <w:sz w:val="19"/>
               </w:rPr>
               <w:t xml:space="preserve">GAP_REJ / </w:t>
-            </w:r>
-            <w:r>
-              <w:rPr>
-                <w:rFonts w:ascii="Arial" w:hAnsi="Arial"/>
-                <w:color w:val="1A1A1A"/>
-                <w:sz w:val="19"/>
-              </w:rPr>
               <w:lastRenderedPageBreak/>
               <w:t>ATTR_CORE</w:t>
             </w:r>
@@ -10935,16 +10709,7 @@
           <w:color w:val="7A5C10"/>
           <w:sz w:val="20"/>
         </w:rPr>
-        <w:t>ℹ</w:t>
-      </w:r>
-      <w:r>
-        <w:rPr>
-          <w:rFonts w:ascii="Arial" w:hAnsi="Arial"/>
-          <w:i/>
-          <w:color w:val="7A5C10"/>
-          <w:sz w:val="20"/>
-        </w:rPr>
-        <w:t xml:space="preserve">  The ATTR_CORE CORE filters (1,500 pt gap and wave extension) should NOT be adjusted without a full 32-month Python backtest. These two filters are the difference between −9.5R and +65.46R — they are the foundation of the ATTR_CORE edge.</w:t>
+        <w:t>ℹ  The ATTR_CORE CORE filters (1,500 pt gap and wave extension) should NOT be adjusted without a full 32-month Python backtest. These two filters are the difference between −9.5R and +65.46R — they are the foundation of the ATTR_CORE edge.</w:t>
       </w:r>
     </w:p>
     <w:p>
@@ -13018,7 +12783,7 @@
           <w:color w:val="AAAAAA"/>
           <w:sz w:val="18"/>
         </w:rPr>
-        <w:t>DXY Pair Strategy  |  Justin Clatworthy  |  The Trading Academy  |  Version 1.0  |  May 2026</w:t>
+        <w:t>DXY Pair Strategy  |  Justin Clatworthy  |  The Trading Academy  |  Version 2.0  |  June 2026</w:t>
       </w:r>
     </w:p>
     <w:p>
@@ -15293,7 +15058,7 @@
           <w:i w:val="0"/>
           <w:sz w:val="20"/>
         </w:rPr>
-        <w:t>Typical live setup: 9 TradingView chart tabs open simultaneously (1 DXY + 8 pairs). Each has one 'alert() function calls' alert pointing to the same webhook endpoint. Your automation receives all events and routes by the 'event' field.</w:t>
+        <w:t>Typical live setup: 9 TradingView chart tabs open simultaneously (1 DXY + 1 USDJPY indicator + 7 pairs). Each has one 'alert() function calls' alert pointing to the same webhook endpoint. Your automation receives all events and routes by the 'event' field.</w:t>
       </w:r>
     </w:p>
     <w:p/>
@@ -15531,7 +15296,7 @@
               <w:rPr>
                 <w:sz w:val="18"/>
               </w:rPr>
-              <w:t>Each pair chart ×8</w:t>
+              <w:t>Each pair chart ×7</w:t>
             </w:r>
           </w:p>
         </w:tc>
@@ -15611,7 +15376,7 @@
           <w:color w:val="C9A02C"/>
           <w:sz w:val="26"/>
         </w:rPr>
-        <w:t>13.1  Full 32-Month Results -- All 8 Pairs</w:t>
+        <w:t>13.1  Full 32-Month Results -- All 7 Pairs (v2.0 parameters)</w:t>
       </w:r>
     </w:p>
     <w:tbl>
@@ -22306,7 +22071,7 @@
           <w:color w:val="444444"/>
           <w:sz w:val="18"/>
         </w:rPr>
-        <w:t>Document version: May 2026. Results from test_expanded_pairs.py run May 2026. Full 15-minute data sourced via Twelve Data API (August 2023 -- May 2026).</w:t>
+        <w:t>Document version: June 2026 (v2.0). Results from generate_v2_trade_log.py. Full 15-minute data sourced via Twelve Data API (September 2023 -- May 2026). Dual indicator: DXY + USDJPY. XAUUSD excluded.</w:t>
       </w:r>
     </w:p>
     <w:sectPr>

</xml_diff>